<commit_message>
Correzioni post studio del labo 0
</commit_message>
<xml_diff>
--- a/ARGOMENTI.docx
+++ b/ARGOMENTI.docx
@@ -48,37 +48,23 @@
           <w:sz w:val="18"/>
           <w:szCs w:val="18"/>
         </w:rPr>
-        <w:t>UN</w:t>
-      </w:r>
-      <w:r>
-        <w:rPr>
-          <w:sz w:val="18"/>
-          <w:szCs w:val="18"/>
-        </w:rPr>
-        <w:t>DIRECTED GRAPH</w:t>
-      </w:r>
-    </w:p>
-    <w:p>
-      <w:pPr>
-        <w:spacing w:after="0"/>
-        <w:rPr>
-          <w:sz w:val="18"/>
-          <w:szCs w:val="18"/>
-        </w:rPr>
-      </w:pPr>
-      <w:r>
-        <w:rPr>
-          <w:sz w:val="18"/>
-          <w:szCs w:val="18"/>
-        </w:rPr>
-        <w:t>A</w:t>
-      </w:r>
-      <w:r>
-        <w:rPr>
-          <w:sz w:val="18"/>
-          <w:szCs w:val="18"/>
-        </w:rPr>
-        <w:t>DJACENCY MATRIX</w:t>
+        <w:t>UNDIRECTED GRAPH</w:t>
+      </w:r>
+    </w:p>
+    <w:p>
+      <w:pPr>
+        <w:spacing w:after="0"/>
+        <w:rPr>
+          <w:sz w:val="18"/>
+          <w:szCs w:val="18"/>
+        </w:rPr>
+      </w:pPr>
+      <w:r>
+        <w:rPr>
+          <w:sz w:val="18"/>
+          <w:szCs w:val="18"/>
+        </w:rPr>
+        <w:t>ADJACENCY MATRIX</w:t>
       </w:r>
     </w:p>
     <w:p>
@@ -110,14 +96,7 @@
           <w:sz w:val="18"/>
           <w:szCs w:val="18"/>
         </w:rPr>
-        <w:t>ADJACENCY</w:t>
-      </w:r>
-      <w:r>
-        <w:rPr>
-          <w:sz w:val="18"/>
-          <w:szCs w:val="18"/>
-        </w:rPr>
-        <w:t xml:space="preserve"> LIST</w:t>
+        <w:t>ADJACENCY LIST</w:t>
       </w:r>
     </w:p>
     <w:p>
@@ -254,14 +233,7 @@
           <w:sz w:val="18"/>
           <w:szCs w:val="18"/>
         </w:rPr>
-        <w:t>DEGREE CENTRALITY</w:t>
-      </w:r>
-      <w:r>
-        <w:rPr>
-          <w:sz w:val="18"/>
-          <w:szCs w:val="18"/>
-        </w:rPr>
-        <w:t xml:space="preserve"> UNDIRECTED GRAPH</w:t>
+        <w:t>DEGREE CENTRALITY UNDIRECTED GRAPH</w:t>
       </w:r>
     </w:p>
     <w:p>
@@ -357,37 +329,23 @@
           <w:sz w:val="18"/>
           <w:szCs w:val="18"/>
         </w:rPr>
-        <w:t xml:space="preserve">STRONGLY </w:t>
-      </w:r>
-      <w:r>
-        <w:rPr>
-          <w:sz w:val="18"/>
-          <w:szCs w:val="18"/>
-        </w:rPr>
-        <w:t>CONNECTED COMPONENT</w:t>
-      </w:r>
-    </w:p>
-    <w:p>
-      <w:pPr>
-        <w:spacing w:after="0"/>
-        <w:rPr>
-          <w:sz w:val="18"/>
-          <w:szCs w:val="18"/>
-        </w:rPr>
-      </w:pPr>
-      <w:r>
-        <w:rPr>
-          <w:sz w:val="18"/>
-          <w:szCs w:val="18"/>
-        </w:rPr>
-        <w:t xml:space="preserve">WEAKLY </w:t>
-      </w:r>
-      <w:r>
-        <w:rPr>
-          <w:sz w:val="18"/>
-          <w:szCs w:val="18"/>
-        </w:rPr>
-        <w:t>CONNECTED COMPONENT</w:t>
+        <w:t>STRONGLY CONNECTED COMPONENT</w:t>
+      </w:r>
+    </w:p>
+    <w:p>
+      <w:pPr>
+        <w:spacing w:after="0"/>
+        <w:rPr>
+          <w:sz w:val="18"/>
+          <w:szCs w:val="18"/>
+        </w:rPr>
+      </w:pPr>
+      <w:r>
+        <w:rPr>
+          <w:sz w:val="18"/>
+          <w:szCs w:val="18"/>
+        </w:rPr>
+        <w:t>WEAKLY CONNECTED COMPONENT</w:t>
       </w:r>
     </w:p>
     <w:p>
@@ -476,14 +434,7 @@
           <w:sz w:val="18"/>
           <w:szCs w:val="18"/>
         </w:rPr>
-        <w:t>R</w:t>
-      </w:r>
-      <w:r>
-        <w:rPr>
-          <w:sz w:val="18"/>
-          <w:szCs w:val="18"/>
-        </w:rPr>
-        <w:t>ANDOM GRAPHS</w:t>
+        <w:t>RANDOM GRAPHS</w:t>
       </w:r>
     </w:p>
     <w:p>
@@ -517,34 +468,7 @@
           <w:szCs w:val="18"/>
         </w:rPr>
         <w:tab/>
-      </w:r>
-      <w:r>
-        <w:rPr>
-          <w:sz w:val="18"/>
-          <w:szCs w:val="18"/>
-        </w:rPr>
-        <w:t>W</w:t>
-      </w:r>
-      <w:r>
-        <w:rPr>
-          <w:sz w:val="18"/>
-          <w:szCs w:val="18"/>
-        </w:rPr>
-        <w:t>ATTS-STROGATZ</w:t>
-      </w:r>
-      <w:r>
-        <w:rPr>
-          <w:sz w:val="18"/>
-          <w:szCs w:val="18"/>
-        </w:rPr>
-        <w:t xml:space="preserve"> M</w:t>
-      </w:r>
-      <w:r>
-        <w:rPr>
-          <w:sz w:val="18"/>
-          <w:szCs w:val="18"/>
-        </w:rPr>
-        <w:t>ODE</w:t>
+        <w:t>WATTS-STROGATZ MODE</w:t>
       </w:r>
     </w:p>
     <w:p>
@@ -561,28 +485,7 @@
           <w:sz w:val="18"/>
           <w:szCs w:val="18"/>
         </w:rPr>
-        <w:t>B</w:t>
-      </w:r>
-      <w:r>
-        <w:rPr>
-          <w:sz w:val="18"/>
-          <w:szCs w:val="18"/>
-        </w:rPr>
-        <w:t>ARABASI</w:t>
-      </w:r>
-      <w:r>
-        <w:rPr>
-          <w:sz w:val="18"/>
-          <w:szCs w:val="18"/>
-        </w:rPr>
-        <w:t>-A</w:t>
-      </w:r>
-      <w:r>
-        <w:rPr>
-          <w:sz w:val="18"/>
-          <w:szCs w:val="18"/>
-        </w:rPr>
-        <w:t>LBERT MODEL</w:t>
+        <w:t>BARABASI-ALBERT MODEL</w:t>
       </w:r>
     </w:p>
     <w:p>
@@ -599,46 +502,32 @@
           <w:sz w:val="18"/>
           <w:szCs w:val="18"/>
         </w:rPr>
-        <w:t>B</w:t>
-      </w:r>
-      <w:r>
-        <w:rPr>
-          <w:sz w:val="18"/>
-          <w:szCs w:val="18"/>
-        </w:rPr>
-        <w:t>ARABASI-BIANCONI MODEL</w:t>
-      </w:r>
-    </w:p>
-    <w:p>
-      <w:pPr>
-        <w:spacing w:after="0"/>
-        <w:rPr>
-          <w:sz w:val="18"/>
-          <w:szCs w:val="18"/>
-        </w:rPr>
-      </w:pPr>
-    </w:p>
-    <w:p>
-      <w:pPr>
-        <w:spacing w:after="0"/>
-        <w:rPr>
-          <w:sz w:val="18"/>
-          <w:szCs w:val="18"/>
-        </w:rPr>
-      </w:pPr>
-      <w:r>
-        <w:rPr>
-          <w:sz w:val="18"/>
-          <w:szCs w:val="18"/>
-        </w:rPr>
-        <w:t>S</w:t>
-      </w:r>
-      <w:r>
-        <w:rPr>
-          <w:sz w:val="18"/>
-          <w:szCs w:val="18"/>
-        </w:rPr>
-        <w:t>CALE-FREE PROPERTIES</w:t>
+        <w:t>BARABASI-BIANCONI MODEL</w:t>
+      </w:r>
+    </w:p>
+    <w:p>
+      <w:pPr>
+        <w:spacing w:after="0"/>
+        <w:rPr>
+          <w:sz w:val="18"/>
+          <w:szCs w:val="18"/>
+        </w:rPr>
+      </w:pPr>
+    </w:p>
+    <w:p>
+      <w:pPr>
+        <w:spacing w:after="0"/>
+        <w:rPr>
+          <w:sz w:val="18"/>
+          <w:szCs w:val="18"/>
+        </w:rPr>
+      </w:pPr>
+      <w:r>
+        <w:rPr>
+          <w:sz w:val="18"/>
+          <w:szCs w:val="18"/>
+        </w:rPr>
+        <w:t>SCALE-FREE PROPERTIES</w:t>
       </w:r>
     </w:p>
     <w:p>
@@ -703,20 +592,7 @@
           <w:szCs w:val="18"/>
         </w:rPr>
         <w:tab/>
-      </w:r>
-      <w:r>
-        <w:rPr>
-          <w:sz w:val="18"/>
-          <w:szCs w:val="18"/>
-        </w:rPr>
-        <w:t>W</w:t>
-      </w:r>
-      <w:r>
-        <w:rPr>
-          <w:sz w:val="18"/>
-          <w:szCs w:val="18"/>
-        </w:rPr>
-        <w:t>EB CRAWLERS</w:t>
+        <w:t>WEB CRAWLERS</w:t>
       </w:r>
     </w:p>
     <w:p>
@@ -809,14 +685,7 @@
           <w:sz w:val="18"/>
           <w:szCs w:val="18"/>
         </w:rPr>
-        <w:t>M</w:t>
-      </w:r>
-      <w:r>
-        <w:rPr>
-          <w:sz w:val="18"/>
-          <w:szCs w:val="18"/>
-        </w:rPr>
-        <w:t xml:space="preserve">ATH BACKGROUND FOR </w:t>
+        <w:t xml:space="preserve">MATH BACKGROUND FOR </w:t>
       </w:r>
       <w:proofErr w:type="spellStart"/>
       <w:r>
@@ -827,6 +696,178 @@
         <w:t>PageRank</w:t>
       </w:r>
       <w:proofErr w:type="spellEnd"/>
+      <w:r>
+        <w:rPr>
+          <w:sz w:val="18"/>
+          <w:szCs w:val="18"/>
+        </w:rPr>
+        <w:t xml:space="preserve"> - </w:t>
+      </w:r>
+      <w:r>
+        <w:rPr>
+          <w:sz w:val="18"/>
+          <w:szCs w:val="18"/>
+        </w:rPr>
+        <w:t>MARKOV PROCESS</w:t>
+      </w:r>
+    </w:p>
+    <w:p>
+      <w:pPr>
+        <w:spacing w:after="0"/>
+        <w:rPr>
+          <w:sz w:val="18"/>
+          <w:szCs w:val="18"/>
+        </w:rPr>
+      </w:pPr>
+      <w:r>
+        <w:rPr>
+          <w:sz w:val="18"/>
+          <w:szCs w:val="18"/>
+        </w:rPr>
+        <w:t xml:space="preserve">GOOGLE </w:t>
+      </w:r>
+      <w:proofErr w:type="spellStart"/>
+      <w:r>
+        <w:rPr>
+          <w:sz w:val="18"/>
+          <w:szCs w:val="18"/>
+        </w:rPr>
+        <w:t>PageRank</w:t>
+      </w:r>
+      <w:proofErr w:type="spellEnd"/>
+    </w:p>
+    <w:p>
+      <w:pPr>
+        <w:spacing w:after="0"/>
+        <w:rPr>
+          <w:sz w:val="18"/>
+          <w:szCs w:val="18"/>
+        </w:rPr>
+      </w:pPr>
+      <w:r>
+        <w:rPr>
+          <w:sz w:val="18"/>
+          <w:szCs w:val="18"/>
+        </w:rPr>
+        <w:t xml:space="preserve">TOPIC-SENSITIVE </w:t>
+      </w:r>
+      <w:proofErr w:type="spellStart"/>
+      <w:r>
+        <w:rPr>
+          <w:sz w:val="18"/>
+          <w:szCs w:val="18"/>
+        </w:rPr>
+        <w:t>PageRank</w:t>
+      </w:r>
+      <w:proofErr w:type="spellEnd"/>
+    </w:p>
+    <w:p>
+      <w:pPr>
+        <w:spacing w:after="0"/>
+        <w:rPr>
+          <w:sz w:val="18"/>
+          <w:szCs w:val="18"/>
+        </w:rPr>
+      </w:pPr>
+      <w:r>
+        <w:rPr>
+          <w:sz w:val="18"/>
+          <w:szCs w:val="18"/>
+        </w:rPr>
+        <w:t>WEB SPAM</w:t>
+      </w:r>
+    </w:p>
+    <w:p>
+      <w:pPr>
+        <w:spacing w:after="0"/>
+        <w:rPr>
+          <w:sz w:val="18"/>
+          <w:szCs w:val="18"/>
+        </w:rPr>
+      </w:pPr>
+      <w:r>
+        <w:rPr>
+          <w:sz w:val="18"/>
+          <w:szCs w:val="18"/>
+        </w:rPr>
+        <w:t>CO-CITATION &amp; BIBLIOGRAPHIC COUPLING</w:t>
+      </w:r>
+      <w:r>
+        <w:rPr>
+          <w:sz w:val="18"/>
+          <w:szCs w:val="18"/>
+        </w:rPr>
+        <w:t xml:space="preserve"> </w:t>
+      </w:r>
+      <w:r>
+        <w:rPr>
+          <w:sz w:val="18"/>
+          <w:szCs w:val="18"/>
+        </w:rPr>
+        <w:t xml:space="preserve">&amp; </w:t>
+      </w:r>
+      <w:r>
+        <w:rPr>
+          <w:sz w:val="18"/>
+          <w:szCs w:val="18"/>
+        </w:rPr>
+        <w:t>CO-REFERENCE</w:t>
+      </w:r>
+    </w:p>
+    <w:p>
+      <w:pPr>
+        <w:spacing w:after="0"/>
+        <w:rPr>
+          <w:sz w:val="18"/>
+          <w:szCs w:val="18"/>
+        </w:rPr>
+      </w:pPr>
+      <w:r>
+        <w:rPr>
+          <w:sz w:val="18"/>
+          <w:szCs w:val="18"/>
+        </w:rPr>
+        <w:t>HUBS AND AUTHORITIES</w:t>
+      </w:r>
+      <w:r>
+        <w:rPr>
+          <w:sz w:val="18"/>
+          <w:szCs w:val="18"/>
+        </w:rPr>
+        <w:t xml:space="preserve"> - </w:t>
+      </w:r>
+      <w:r>
+        <w:rPr>
+          <w:sz w:val="18"/>
+          <w:szCs w:val="18"/>
+        </w:rPr>
+        <w:t>HITS</w:t>
+      </w:r>
+    </w:p>
+    <w:p>
+      <w:pPr>
+        <w:spacing w:after="0"/>
+        <w:rPr>
+          <w:sz w:val="18"/>
+          <w:szCs w:val="18"/>
+        </w:rPr>
+      </w:pPr>
+    </w:p>
+    <w:p>
+      <w:pPr>
+        <w:spacing w:after="0"/>
+        <w:rPr>
+          <w:sz w:val="18"/>
+          <w:szCs w:val="18"/>
+        </w:rPr>
+      </w:pPr>
+      <w:r>
+        <w:rPr>
+          <w:sz w:val="18"/>
+          <w:szCs w:val="18"/>
+        </w:rPr>
+        <w:t>PATTERNS OF RELATIONS</w:t>
+      </w:r>
     </w:p>
     <w:p>
       <w:pPr>
@@ -842,144 +883,7 @@
           <w:szCs w:val="18"/>
         </w:rPr>
         <w:tab/>
-      </w:r>
-      <w:r>
-        <w:rPr>
-          <w:sz w:val="18"/>
-          <w:szCs w:val="18"/>
-        </w:rPr>
-        <w:t>M</w:t>
-      </w:r>
-      <w:r>
-        <w:rPr>
-          <w:sz w:val="18"/>
-          <w:szCs w:val="18"/>
-        </w:rPr>
-        <w:t>ARKOV PROCESS</w:t>
-      </w:r>
-    </w:p>
-    <w:p>
-      <w:pPr>
-        <w:spacing w:after="0"/>
-        <w:rPr>
-          <w:sz w:val="18"/>
-          <w:szCs w:val="18"/>
-        </w:rPr>
-      </w:pPr>
-    </w:p>
-    <w:p>
-      <w:pPr>
-        <w:spacing w:after="0"/>
-        <w:rPr>
-          <w:sz w:val="18"/>
-          <w:szCs w:val="18"/>
-        </w:rPr>
-      </w:pPr>
-      <w:r>
-        <w:rPr>
-          <w:sz w:val="18"/>
-          <w:szCs w:val="18"/>
-        </w:rPr>
-        <w:t>G</w:t>
-      </w:r>
-      <w:r>
-        <w:rPr>
-          <w:sz w:val="18"/>
-          <w:szCs w:val="18"/>
-        </w:rPr>
-        <w:t>OOGLE</w:t>
-      </w:r>
-      <w:r>
-        <w:rPr>
-          <w:sz w:val="18"/>
-          <w:szCs w:val="18"/>
-        </w:rPr>
-        <w:t xml:space="preserve"> PageRank</w:t>
-      </w:r>
-    </w:p>
-    <w:p>
-      <w:pPr>
-        <w:spacing w:after="0"/>
-        <w:rPr>
-          <w:sz w:val="18"/>
-          <w:szCs w:val="18"/>
-        </w:rPr>
-      </w:pPr>
-      <w:r>
-        <w:rPr>
-          <w:sz w:val="18"/>
-          <w:szCs w:val="18"/>
-        </w:rPr>
-        <w:t>T</w:t>
-      </w:r>
-      <w:r>
-        <w:rPr>
-          <w:sz w:val="18"/>
-          <w:szCs w:val="18"/>
-        </w:rPr>
-        <w:t xml:space="preserve">OPIC-SENSITIVE </w:t>
-      </w:r>
-      <w:proofErr w:type="spellStart"/>
-      <w:r>
-        <w:rPr>
-          <w:sz w:val="18"/>
-          <w:szCs w:val="18"/>
-        </w:rPr>
-        <w:t>PageRank</w:t>
-      </w:r>
-      <w:proofErr w:type="spellEnd"/>
-    </w:p>
-    <w:p>
-      <w:pPr>
-        <w:spacing w:after="0"/>
-        <w:rPr>
-          <w:sz w:val="18"/>
-          <w:szCs w:val="18"/>
-        </w:rPr>
-      </w:pPr>
-      <w:r>
-        <w:rPr>
-          <w:sz w:val="18"/>
-          <w:szCs w:val="18"/>
-        </w:rPr>
-        <w:t>WEB SPAM</w:t>
-      </w:r>
-    </w:p>
-    <w:p>
-      <w:pPr>
-        <w:spacing w:after="0"/>
-        <w:rPr>
-          <w:sz w:val="18"/>
-          <w:szCs w:val="18"/>
-        </w:rPr>
-      </w:pPr>
-      <w:r>
-        <w:rPr>
-          <w:sz w:val="18"/>
-          <w:szCs w:val="18"/>
-        </w:rPr>
-        <w:t>C</w:t>
-      </w:r>
-      <w:r>
-        <w:rPr>
-          <w:sz w:val="18"/>
-          <w:szCs w:val="18"/>
-        </w:rPr>
-        <w:t xml:space="preserve">O-CITATION </w:t>
-      </w:r>
-      <w:r>
-        <w:rPr>
-          <w:sz w:val="18"/>
-          <w:szCs w:val="18"/>
-        </w:rPr>
-        <w:t>&amp; B</w:t>
-      </w:r>
-      <w:r>
-        <w:rPr>
-          <w:sz w:val="18"/>
-          <w:szCs w:val="18"/>
-        </w:rPr>
-        <w:t>IBLIOGRAPHIC COUPLING</w:t>
+        <w:t>STRUCTURAL EQUIVALENCE</w:t>
       </w:r>
     </w:p>
     <w:p>
@@ -996,39 +900,110 @@
           <w:szCs w:val="18"/>
         </w:rPr>
         <w:tab/>
-        <w:t>CO-REFERENCE</w:t>
-      </w:r>
-    </w:p>
-    <w:p>
-      <w:pPr>
-        <w:spacing w:after="0"/>
-        <w:rPr>
-          <w:sz w:val="18"/>
-          <w:szCs w:val="18"/>
-        </w:rPr>
-      </w:pPr>
-    </w:p>
-    <w:p>
-      <w:pPr>
-        <w:spacing w:after="0"/>
-        <w:rPr>
-          <w:sz w:val="18"/>
-          <w:szCs w:val="18"/>
-        </w:rPr>
-      </w:pPr>
-      <w:r>
-        <w:rPr>
-          <w:sz w:val="18"/>
-          <w:szCs w:val="18"/>
-        </w:rPr>
-        <w:t>H</w:t>
-      </w:r>
-      <w:r>
-        <w:rPr>
-          <w:sz w:val="18"/>
-          <w:szCs w:val="18"/>
-        </w:rPr>
-        <w:t>UBS AND AUTHORITIES</w:t>
+        <w:t>AUTOMORPHIC EQUIVALENCE</w:t>
+      </w:r>
+    </w:p>
+    <w:p>
+      <w:pPr>
+        <w:spacing w:after="0"/>
+        <w:ind w:firstLine="708"/>
+        <w:rPr>
+          <w:sz w:val="18"/>
+          <w:szCs w:val="18"/>
+        </w:rPr>
+      </w:pPr>
+      <w:r>
+        <w:rPr>
+          <w:sz w:val="18"/>
+          <w:szCs w:val="18"/>
+        </w:rPr>
+        <w:t>SIMILARITY MEASURES</w:t>
+      </w:r>
+    </w:p>
+    <w:p>
+      <w:pPr>
+        <w:spacing w:after="0"/>
+        <w:ind w:left="708" w:firstLine="708"/>
+        <w:rPr>
+          <w:sz w:val="18"/>
+          <w:szCs w:val="18"/>
+        </w:rPr>
+      </w:pPr>
+      <w:r>
+        <w:rPr>
+          <w:sz w:val="18"/>
+          <w:szCs w:val="18"/>
+        </w:rPr>
+        <w:t>JACCARD SIMILARITY</w:t>
+      </w:r>
+    </w:p>
+    <w:p>
+      <w:pPr>
+        <w:spacing w:after="0"/>
+        <w:ind w:left="708" w:firstLine="708"/>
+        <w:rPr>
+          <w:sz w:val="18"/>
+          <w:szCs w:val="18"/>
+        </w:rPr>
+      </w:pPr>
+      <w:r>
+        <w:rPr>
+          <w:sz w:val="18"/>
+          <w:szCs w:val="18"/>
+        </w:rPr>
+        <w:t>COSINE SIMILARITY</w:t>
+      </w:r>
+    </w:p>
+    <w:p>
+      <w:pPr>
+        <w:spacing w:after="0"/>
+        <w:ind w:left="708" w:firstLine="708"/>
+        <w:rPr>
+          <w:sz w:val="18"/>
+          <w:szCs w:val="18"/>
+        </w:rPr>
+      </w:pPr>
+      <w:r>
+        <w:rPr>
+          <w:sz w:val="18"/>
+          <w:szCs w:val="18"/>
+        </w:rPr>
+        <w:t>PEARSON CORRELATION COEFFICIENT</w:t>
+      </w:r>
+    </w:p>
+    <w:p>
+      <w:pPr>
+        <w:spacing w:after="0"/>
+        <w:rPr>
+          <w:sz w:val="18"/>
+          <w:szCs w:val="18"/>
+        </w:rPr>
+      </w:pPr>
+    </w:p>
+    <w:p>
+      <w:pPr>
+        <w:spacing w:after="0"/>
+        <w:rPr>
+          <w:sz w:val="18"/>
+          <w:szCs w:val="18"/>
+        </w:rPr>
+      </w:pPr>
+    </w:p>
+    <w:p>
+      <w:pPr>
+        <w:spacing w:after="0"/>
+        <w:rPr>
+          <w:sz w:val="18"/>
+          <w:szCs w:val="18"/>
+        </w:rPr>
+      </w:pPr>
+      <w:r>
+        <w:rPr>
+          <w:sz w:val="18"/>
+          <w:szCs w:val="18"/>
+        </w:rPr>
+        <w:lastRenderedPageBreak/>
+        <w:t>ASSORTATIVITY</w:t>
       </w:r>
     </w:p>
     <w:p>
@@ -1045,39 +1020,94 @@
           <w:szCs w:val="18"/>
         </w:rPr>
         <w:tab/>
-        <w:t>HITS</w:t>
-      </w:r>
-    </w:p>
-    <w:p>
-      <w:pPr>
-        <w:spacing w:after="0"/>
-        <w:rPr>
-          <w:sz w:val="18"/>
-          <w:szCs w:val="18"/>
-        </w:rPr>
-      </w:pPr>
-    </w:p>
-    <w:p>
-      <w:pPr>
-        <w:spacing w:after="0"/>
-        <w:rPr>
-          <w:sz w:val="18"/>
-          <w:szCs w:val="18"/>
-        </w:rPr>
-      </w:pPr>
-      <w:r>
-        <w:rPr>
-          <w:sz w:val="18"/>
-          <w:szCs w:val="18"/>
-        </w:rPr>
-        <w:t>P</w:t>
-      </w:r>
-      <w:r>
-        <w:rPr>
-          <w:sz w:val="18"/>
-          <w:szCs w:val="18"/>
-        </w:rPr>
-        <w:t>ATTERNS OF RELATIONS</w:t>
+        <w:t>HOMOPHILY</w:t>
+      </w:r>
+    </w:p>
+    <w:p>
+      <w:pPr>
+        <w:spacing w:after="0"/>
+        <w:ind w:firstLine="708"/>
+        <w:rPr>
+          <w:sz w:val="18"/>
+          <w:szCs w:val="18"/>
+        </w:rPr>
+      </w:pPr>
+      <w:r>
+        <w:rPr>
+          <w:sz w:val="18"/>
+          <w:szCs w:val="18"/>
+        </w:rPr>
+        <w:t xml:space="preserve">ASSORTATIVE AND </w:t>
+      </w:r>
+      <w:r>
+        <w:rPr>
+          <w:sz w:val="18"/>
+          <w:szCs w:val="18"/>
+        </w:rPr>
+        <w:t>D</w:t>
+      </w:r>
+      <w:r>
+        <w:rPr>
+          <w:sz w:val="18"/>
+          <w:szCs w:val="18"/>
+        </w:rPr>
+        <w:t>ISASSORTATIVE MIXING</w:t>
+      </w:r>
+    </w:p>
+    <w:p>
+      <w:pPr>
+        <w:spacing w:after="0"/>
+        <w:ind w:firstLine="708"/>
+        <w:rPr>
+          <w:sz w:val="18"/>
+          <w:szCs w:val="18"/>
+        </w:rPr>
+      </w:pPr>
+      <w:r>
+        <w:rPr>
+          <w:sz w:val="18"/>
+          <w:szCs w:val="18"/>
+        </w:rPr>
+        <w:t xml:space="preserve">ASSORTATIVE AND </w:t>
+      </w:r>
+      <w:r>
+        <w:rPr>
+          <w:sz w:val="18"/>
+          <w:szCs w:val="18"/>
+        </w:rPr>
+        <w:t>DI</w:t>
+      </w:r>
+      <w:r>
+        <w:rPr>
+          <w:sz w:val="18"/>
+          <w:szCs w:val="18"/>
+        </w:rPr>
+        <w:t>SASSORTATIVE NETWORKS</w:t>
+      </w:r>
+    </w:p>
+    <w:p>
+      <w:pPr>
+        <w:spacing w:after="0"/>
+        <w:rPr>
+          <w:sz w:val="18"/>
+          <w:szCs w:val="18"/>
+        </w:rPr>
+      </w:pPr>
+    </w:p>
+    <w:p>
+      <w:pPr>
+        <w:spacing w:after="0"/>
+        <w:rPr>
+          <w:sz w:val="18"/>
+          <w:szCs w:val="18"/>
+        </w:rPr>
+      </w:pPr>
+      <w:r>
+        <w:rPr>
+          <w:sz w:val="18"/>
+          <w:szCs w:val="18"/>
+        </w:rPr>
+        <w:t>COMMUNITIES IN NETWORKS</w:t>
       </w:r>
     </w:p>
     <w:p>
@@ -1094,20 +1124,7 @@
           <w:szCs w:val="18"/>
         </w:rPr>
         <w:tab/>
-      </w:r>
-      <w:r>
-        <w:rPr>
-          <w:sz w:val="18"/>
-          <w:szCs w:val="18"/>
-        </w:rPr>
-        <w:t>S</w:t>
-      </w:r>
-      <w:r>
-        <w:rPr>
-          <w:sz w:val="18"/>
-          <w:szCs w:val="18"/>
-        </w:rPr>
-        <w:t>TRUCTURAL EQUIVALENCE</w:t>
+        <w:t>ZACHARY KARATE CLUB</w:t>
       </w:r>
     </w:p>
     <w:p>
@@ -1124,27 +1141,7 @@
           <w:szCs w:val="18"/>
         </w:rPr>
         <w:tab/>
-      </w:r>
-      <w:r>
-        <w:rPr>
-          <w:sz w:val="18"/>
-          <w:szCs w:val="18"/>
-        </w:rPr>
-        <w:t>A</w:t>
-      </w:r>
-      <w:r>
-        <w:rPr>
-          <w:sz w:val="18"/>
-          <w:szCs w:val="18"/>
-        </w:rPr>
-        <w:t>UTOMORPHIC</w:t>
-      </w:r>
-      <w:r>
-        <w:rPr>
-          <w:sz w:val="18"/>
-          <w:szCs w:val="18"/>
-        </w:rPr>
-        <w:t xml:space="preserve"> EQUIVALENCE</w:t>
+        <w:t>GRAPH BISECTION</w:t>
       </w:r>
     </w:p>
     <w:p>
@@ -1161,109 +1158,7 @@
           <w:szCs w:val="18"/>
         </w:rPr>
         <w:tab/>
-      </w:r>
-      <w:r>
-        <w:rPr>
-          <w:sz w:val="18"/>
-          <w:szCs w:val="18"/>
-        </w:rPr>
-        <w:t>S</w:t>
-      </w:r>
-      <w:r>
-        <w:rPr>
-          <w:sz w:val="18"/>
-          <w:szCs w:val="18"/>
-        </w:rPr>
-        <w:t>IMILARITY MEASURES</w:t>
-      </w:r>
-    </w:p>
-    <w:p>
-      <w:pPr>
-        <w:spacing w:after="0"/>
-        <w:rPr>
-          <w:sz w:val="18"/>
-          <w:szCs w:val="18"/>
-        </w:rPr>
-      </w:pPr>
-    </w:p>
-    <w:p>
-      <w:pPr>
-        <w:spacing w:after="0"/>
-        <w:rPr>
-          <w:sz w:val="18"/>
-          <w:szCs w:val="18"/>
-        </w:rPr>
-      </w:pPr>
-      <w:r>
-        <w:rPr>
-          <w:sz w:val="18"/>
-          <w:szCs w:val="18"/>
-        </w:rPr>
-        <w:t>JACCARD SIMILARITY</w:t>
-      </w:r>
-    </w:p>
-    <w:p>
-      <w:pPr>
-        <w:spacing w:after="0"/>
-        <w:rPr>
-          <w:sz w:val="18"/>
-          <w:szCs w:val="18"/>
-        </w:rPr>
-      </w:pPr>
-      <w:r>
-        <w:rPr>
-          <w:sz w:val="18"/>
-          <w:szCs w:val="18"/>
-        </w:rPr>
-        <w:t>COSINE SIMILARITY</w:t>
-      </w:r>
-    </w:p>
-    <w:p>
-      <w:pPr>
-        <w:spacing w:after="0"/>
-        <w:rPr>
-          <w:sz w:val="18"/>
-          <w:szCs w:val="18"/>
-        </w:rPr>
-      </w:pPr>
-      <w:r>
-        <w:rPr>
-          <w:sz w:val="18"/>
-          <w:szCs w:val="18"/>
-        </w:rPr>
-        <w:t>P</w:t>
-      </w:r>
-      <w:r>
-        <w:rPr>
-          <w:sz w:val="18"/>
-          <w:szCs w:val="18"/>
-        </w:rPr>
-        <w:t>EARSON CORRELATION COEFFICIENT</w:t>
-      </w:r>
-    </w:p>
-    <w:p>
-      <w:pPr>
-        <w:spacing w:after="0"/>
-        <w:rPr>
-          <w:sz w:val="18"/>
-          <w:szCs w:val="18"/>
-        </w:rPr>
-      </w:pPr>
-    </w:p>
-    <w:p>
-      <w:pPr>
-        <w:spacing w:after="0"/>
-        <w:rPr>
-          <w:sz w:val="18"/>
-          <w:szCs w:val="18"/>
-        </w:rPr>
-      </w:pPr>
-      <w:r>
-        <w:rPr>
-          <w:sz w:val="18"/>
-          <w:szCs w:val="18"/>
-        </w:rPr>
-        <w:t>ASSORTATIVITY</w:t>
+        <w:t>RECURSIVE BISECTION</w:t>
       </w:r>
     </w:p>
     <w:p>
@@ -1280,20 +1175,7 @@
           <w:szCs w:val="18"/>
         </w:rPr>
         <w:tab/>
-      </w:r>
-      <w:r>
-        <w:rPr>
-          <w:sz w:val="18"/>
-          <w:szCs w:val="18"/>
-        </w:rPr>
-        <w:t>H</w:t>
-      </w:r>
-      <w:r>
-        <w:rPr>
-          <w:sz w:val="18"/>
-          <w:szCs w:val="18"/>
-        </w:rPr>
-        <w:t>OMOPHILY</w:t>
+        <w:t>MULTI-LEVEL GRAPH PARTITIONING</w:t>
       </w:r>
     </w:p>
     <w:p>
@@ -1310,14 +1192,7 @@
           <w:sz w:val="18"/>
           <w:szCs w:val="18"/>
         </w:rPr>
-        <w:t>A</w:t>
-      </w:r>
-      <w:r>
-        <w:rPr>
-          <w:sz w:val="18"/>
-          <w:szCs w:val="18"/>
-        </w:rPr>
-        <w:t>SSORTATIVE AND SISASSORTATIVE MIXING</w:t>
+        <w:t>MUTUALITY OF TIES: MAXIMUM CLIQUES</w:t>
       </w:r>
     </w:p>
     <w:p>
@@ -1334,46 +1209,66 @@
           <w:sz w:val="18"/>
           <w:szCs w:val="18"/>
         </w:rPr>
-        <w:t xml:space="preserve">ASSORTATIVE AND SISASSORTATIVE </w:t>
-      </w:r>
-      <w:r>
-        <w:rPr>
-          <w:sz w:val="18"/>
-          <w:szCs w:val="18"/>
-        </w:rPr>
-        <w:t>NETWORKS</w:t>
-      </w:r>
-    </w:p>
-    <w:p>
-      <w:pPr>
-        <w:spacing w:after="0"/>
-        <w:rPr>
-          <w:sz w:val="18"/>
-          <w:szCs w:val="18"/>
-        </w:rPr>
-      </w:pPr>
-    </w:p>
-    <w:p>
-      <w:pPr>
-        <w:spacing w:after="0"/>
-        <w:rPr>
-          <w:sz w:val="18"/>
-          <w:szCs w:val="18"/>
-        </w:rPr>
-      </w:pPr>
-      <w:r>
-        <w:rPr>
-          <w:sz w:val="18"/>
-          <w:szCs w:val="18"/>
-        </w:rPr>
-        <w:t>C</w:t>
-      </w:r>
-      <w:r>
-        <w:rPr>
-          <w:sz w:val="18"/>
-          <w:szCs w:val="18"/>
-        </w:rPr>
-        <w:t>OMMUNITIES IN NETWORKS</w:t>
+        <w:t xml:space="preserve">FREQUENCY </w:t>
+      </w:r>
+      <w:r>
+        <w:rPr>
+          <w:sz w:val="18"/>
+          <w:szCs w:val="18"/>
+        </w:rPr>
+        <w:t>OF TIES: STRONG AND WEAK COMMUNITIES</w:t>
+      </w:r>
+    </w:p>
+    <w:p>
+      <w:pPr>
+        <w:spacing w:after="0"/>
+        <w:ind w:firstLine="708"/>
+        <w:rPr>
+          <w:sz w:val="18"/>
+          <w:szCs w:val="18"/>
+        </w:rPr>
+      </w:pPr>
+      <w:r>
+        <w:rPr>
+          <w:sz w:val="18"/>
+          <w:szCs w:val="18"/>
+        </w:rPr>
+        <w:t>FREQUENCY OF TIES: K-CORES</w:t>
+      </w:r>
+    </w:p>
+    <w:p>
+      <w:pPr>
+        <w:spacing w:after="0"/>
+        <w:ind w:firstLine="708"/>
+        <w:rPr>
+          <w:sz w:val="18"/>
+          <w:szCs w:val="18"/>
+        </w:rPr>
+      </w:pPr>
+      <w:r>
+        <w:rPr>
+          <w:sz w:val="18"/>
+          <w:szCs w:val="18"/>
+        </w:rPr>
+        <w:t>CORE DECOMPOSITION</w:t>
+      </w:r>
+    </w:p>
+    <w:p>
+      <w:pPr>
+        <w:spacing w:after="0"/>
+        <w:ind w:firstLine="708"/>
+        <w:rPr>
+          <w:sz w:val="18"/>
+          <w:szCs w:val="18"/>
+          <w:u w:val="single"/>
+        </w:rPr>
+      </w:pPr>
+      <w:r>
+        <w:rPr>
+          <w:sz w:val="18"/>
+          <w:szCs w:val="18"/>
+        </w:rPr>
+        <w:t>CLOSENESS OR REACHABILITY: K-DISTANCE CLIQUES</w:t>
       </w:r>
     </w:p>
     <w:p>
@@ -1390,145 +1285,7 @@
           <w:szCs w:val="18"/>
         </w:rPr>
         <w:tab/>
-      </w:r>
-      <w:r>
-        <w:rPr>
-          <w:sz w:val="18"/>
-          <w:szCs w:val="18"/>
-        </w:rPr>
-        <w:t>Z</w:t>
-      </w:r>
-      <w:r>
-        <w:rPr>
-          <w:sz w:val="18"/>
-          <w:szCs w:val="18"/>
-        </w:rPr>
-        <w:t xml:space="preserve">ACHARY </w:t>
-      </w:r>
-      <w:r>
-        <w:rPr>
-          <w:sz w:val="18"/>
-          <w:szCs w:val="18"/>
-        </w:rPr>
-        <w:t>K</w:t>
-      </w:r>
-      <w:r>
-        <w:rPr>
-          <w:sz w:val="18"/>
-          <w:szCs w:val="18"/>
-        </w:rPr>
-        <w:t>ARATE</w:t>
-      </w:r>
-      <w:r>
-        <w:rPr>
-          <w:sz w:val="18"/>
-          <w:szCs w:val="18"/>
-        </w:rPr>
-        <w:t xml:space="preserve"> C</w:t>
-      </w:r>
-      <w:r>
-        <w:rPr>
-          <w:sz w:val="18"/>
-          <w:szCs w:val="18"/>
-        </w:rPr>
-        <w:t>LUB</w:t>
-      </w:r>
-    </w:p>
-    <w:p>
-      <w:pPr>
-        <w:spacing w:after="0"/>
-        <w:rPr>
-          <w:sz w:val="18"/>
-          <w:szCs w:val="18"/>
-        </w:rPr>
-      </w:pPr>
-      <w:r>
-        <w:rPr>
-          <w:sz w:val="18"/>
-          <w:szCs w:val="18"/>
-        </w:rPr>
-        <w:tab/>
-      </w:r>
-      <w:r>
-        <w:rPr>
-          <w:sz w:val="18"/>
-          <w:szCs w:val="18"/>
-        </w:rPr>
-        <w:t>G</w:t>
-      </w:r>
-      <w:r>
-        <w:rPr>
-          <w:sz w:val="18"/>
-          <w:szCs w:val="18"/>
-        </w:rPr>
-        <w:t>RAPH BISECTION</w:t>
-      </w:r>
-    </w:p>
-    <w:p>
-      <w:pPr>
-        <w:spacing w:after="0"/>
-        <w:rPr>
-          <w:sz w:val="18"/>
-          <w:szCs w:val="18"/>
-        </w:rPr>
-      </w:pPr>
-      <w:r>
-        <w:rPr>
-          <w:sz w:val="18"/>
-          <w:szCs w:val="18"/>
-        </w:rPr>
-        <w:tab/>
-      </w:r>
-      <w:r>
-        <w:rPr>
-          <w:sz w:val="18"/>
-          <w:szCs w:val="18"/>
-        </w:rPr>
-        <w:t>R</w:t>
-      </w:r>
-      <w:r>
-        <w:rPr>
-          <w:sz w:val="18"/>
-          <w:szCs w:val="18"/>
-        </w:rPr>
-        <w:t>ECURSIVE</w:t>
-      </w:r>
-      <w:r>
-        <w:rPr>
-          <w:sz w:val="18"/>
-          <w:szCs w:val="18"/>
-        </w:rPr>
-        <w:t xml:space="preserve"> BISECTION</w:t>
-      </w:r>
-    </w:p>
-    <w:p>
-      <w:pPr>
-        <w:spacing w:after="0"/>
-        <w:rPr>
-          <w:sz w:val="18"/>
-          <w:szCs w:val="18"/>
-        </w:rPr>
-      </w:pPr>
-      <w:r>
-        <w:rPr>
-          <w:sz w:val="18"/>
-          <w:szCs w:val="18"/>
-        </w:rPr>
-        <w:tab/>
-      </w:r>
-      <w:r>
-        <w:rPr>
-          <w:sz w:val="18"/>
-          <w:szCs w:val="18"/>
-        </w:rPr>
-        <w:t>M</w:t>
-      </w:r>
-      <w:r>
-        <w:rPr>
-          <w:sz w:val="18"/>
-          <w:szCs w:val="18"/>
-        </w:rPr>
-        <w:t>ULTI-LEVEL GRAPH PARTITIONING</w:t>
+        <w:t>COMMUNITY DETECTION</w:t>
       </w:r>
     </w:p>
     <w:p>
@@ -1545,28 +1302,7 @@
           <w:sz w:val="18"/>
           <w:szCs w:val="18"/>
         </w:rPr>
-        <w:t>M</w:t>
-      </w:r>
-      <w:r>
-        <w:rPr>
-          <w:sz w:val="18"/>
-          <w:szCs w:val="18"/>
-        </w:rPr>
-        <w:t>UTUALITY OF TIES:</w:t>
-      </w:r>
-      <w:r>
-        <w:rPr>
-          <w:sz w:val="18"/>
-          <w:szCs w:val="18"/>
-        </w:rPr>
-        <w:t xml:space="preserve"> M</w:t>
-      </w:r>
-      <w:r>
-        <w:rPr>
-          <w:sz w:val="18"/>
-          <w:szCs w:val="18"/>
-        </w:rPr>
-        <w:t>AXIMUM CLIQUES</w:t>
+        <w:t>LABEL PROPAGATION</w:t>
       </w:r>
     </w:p>
     <w:p>
@@ -1583,21 +1319,7 @@
           <w:sz w:val="18"/>
           <w:szCs w:val="18"/>
         </w:rPr>
-        <w:t>F</w:t>
-      </w:r>
-      <w:r>
-        <w:rPr>
-          <w:sz w:val="18"/>
-          <w:szCs w:val="18"/>
-        </w:rPr>
-        <w:t xml:space="preserve">REQUENCY </w:t>
-      </w:r>
-      <w:r>
-        <w:rPr>
-          <w:sz w:val="18"/>
-          <w:szCs w:val="18"/>
-        </w:rPr>
-        <w:t>OF TIES: STRONG AND WEAK COMMUNITIES</w:t>
+        <w:t>THE GIRVAN-NEWMAN ALGORITHM</w:t>
       </w:r>
     </w:p>
     <w:p>
@@ -1614,179 +1336,7 @@
           <w:sz w:val="18"/>
           <w:szCs w:val="18"/>
         </w:rPr>
-        <w:t xml:space="preserve">FREQUENCY OF TIES: </w:t>
-      </w:r>
-      <w:r>
-        <w:rPr>
-          <w:sz w:val="18"/>
-          <w:szCs w:val="18"/>
-        </w:rPr>
-        <w:t>K-CORES</w:t>
-      </w:r>
-    </w:p>
-    <w:p>
-      <w:pPr>
-        <w:spacing w:after="0"/>
-        <w:ind w:firstLine="708"/>
-        <w:rPr>
-          <w:sz w:val="18"/>
-          <w:szCs w:val="18"/>
-        </w:rPr>
-      </w:pPr>
-      <w:r>
-        <w:rPr>
-          <w:sz w:val="18"/>
-          <w:szCs w:val="18"/>
-        </w:rPr>
-        <w:t>C</w:t>
-      </w:r>
-      <w:r>
-        <w:rPr>
-          <w:sz w:val="18"/>
-          <w:szCs w:val="18"/>
-        </w:rPr>
-        <w:t>ORE DECOMPOSITION</w:t>
-      </w:r>
-    </w:p>
-    <w:p>
-      <w:pPr>
-        <w:spacing w:after="0"/>
-        <w:ind w:firstLine="708"/>
-        <w:rPr>
-          <w:sz w:val="18"/>
-          <w:szCs w:val="18"/>
-          <w:u w:val="single"/>
-        </w:rPr>
-      </w:pPr>
-      <w:r>
-        <w:rPr>
-          <w:sz w:val="18"/>
-          <w:szCs w:val="18"/>
-        </w:rPr>
-        <w:t>C</w:t>
-      </w:r>
-      <w:r>
-        <w:rPr>
-          <w:sz w:val="18"/>
-          <w:szCs w:val="18"/>
-        </w:rPr>
-        <w:t>LOSENESS OR REACHABILITY: K-DISTANCE CLIQUES</w:t>
-      </w:r>
-    </w:p>
-    <w:p>
-      <w:pPr>
-        <w:spacing w:after="0"/>
-        <w:rPr>
-          <w:sz w:val="18"/>
-          <w:szCs w:val="18"/>
-        </w:rPr>
-      </w:pPr>
-      <w:r>
-        <w:rPr>
-          <w:sz w:val="18"/>
-          <w:szCs w:val="18"/>
-        </w:rPr>
-        <w:tab/>
-      </w:r>
-      <w:r>
-        <w:rPr>
-          <w:sz w:val="18"/>
-          <w:szCs w:val="18"/>
-        </w:rPr>
-        <w:t>C</w:t>
-      </w:r>
-      <w:r>
-        <w:rPr>
-          <w:sz w:val="18"/>
-          <w:szCs w:val="18"/>
-        </w:rPr>
-        <w:t>OMMUNITY DETECTION</w:t>
-      </w:r>
-    </w:p>
-    <w:p>
-      <w:pPr>
-        <w:spacing w:after="0"/>
-        <w:ind w:firstLine="708"/>
-        <w:rPr>
-          <w:sz w:val="18"/>
-          <w:szCs w:val="18"/>
-        </w:rPr>
-      </w:pPr>
-      <w:r>
-        <w:rPr>
-          <w:sz w:val="18"/>
-          <w:szCs w:val="18"/>
-        </w:rPr>
-        <w:t>L</w:t>
-      </w:r>
-      <w:r>
-        <w:rPr>
-          <w:sz w:val="18"/>
-          <w:szCs w:val="18"/>
-        </w:rPr>
-        <w:t>ABEL PROPAGATION</w:t>
-      </w:r>
-    </w:p>
-    <w:p>
-      <w:pPr>
-        <w:spacing w:after="0"/>
-        <w:ind w:firstLine="708"/>
-        <w:rPr>
-          <w:sz w:val="18"/>
-          <w:szCs w:val="18"/>
-        </w:rPr>
-      </w:pPr>
-      <w:r>
-        <w:rPr>
-          <w:sz w:val="18"/>
-          <w:szCs w:val="18"/>
-        </w:rPr>
-        <w:t>T</w:t>
-      </w:r>
-      <w:r>
-        <w:rPr>
-          <w:sz w:val="18"/>
-          <w:szCs w:val="18"/>
-        </w:rPr>
-        <w:t xml:space="preserve">HE </w:t>
-      </w:r>
-      <w:r>
-        <w:rPr>
-          <w:sz w:val="18"/>
-          <w:szCs w:val="18"/>
-        </w:rPr>
-        <w:t>G</w:t>
-      </w:r>
-      <w:r>
-        <w:rPr>
-          <w:sz w:val="18"/>
-          <w:szCs w:val="18"/>
-        </w:rPr>
-        <w:t>IRVAN-NEWMAN ALGORITHM</w:t>
-      </w:r>
-    </w:p>
-    <w:p>
-      <w:pPr>
-        <w:spacing w:after="0"/>
-        <w:ind w:firstLine="708"/>
-        <w:rPr>
-          <w:sz w:val="18"/>
-          <w:szCs w:val="18"/>
-        </w:rPr>
-      </w:pPr>
-      <w:r>
-        <w:rPr>
-          <w:sz w:val="18"/>
-          <w:szCs w:val="18"/>
-        </w:rPr>
-        <w:t>M</w:t>
-      </w:r>
-      <w:r>
-        <w:rPr>
-          <w:sz w:val="18"/>
-          <w:szCs w:val="18"/>
-        </w:rPr>
-        <w:t>ODULARITY VS ASSORTATIVITY</w:t>
+        <w:t>MODULARITY VS ASSORTATIVITY</w:t>
       </w:r>
     </w:p>
     <w:p>
@@ -1861,263 +1411,137 @@
           <w:sz w:val="18"/>
           <w:szCs w:val="18"/>
         </w:rPr>
-        <w:t>O</w:t>
-      </w:r>
-      <w:r>
-        <w:rPr>
-          <w:sz w:val="18"/>
-          <w:szCs w:val="18"/>
-        </w:rPr>
-        <w:t>VERLAPPING COMMUNITIES</w:t>
-      </w:r>
-    </w:p>
-    <w:p>
-      <w:pPr>
-        <w:spacing w:after="0"/>
-        <w:rPr>
-          <w:sz w:val="18"/>
-          <w:szCs w:val="18"/>
-        </w:rPr>
-      </w:pPr>
-      <w:r>
-        <w:rPr>
-          <w:sz w:val="18"/>
-          <w:szCs w:val="18"/>
-        </w:rPr>
-        <w:t>S</w:t>
-      </w:r>
-      <w:r>
-        <w:rPr>
-          <w:sz w:val="18"/>
-          <w:szCs w:val="18"/>
-        </w:rPr>
-        <w:t>PEAKER-LISTENER LABEL</w:t>
-      </w:r>
-      <w:r>
-        <w:rPr>
-          <w:sz w:val="18"/>
-          <w:szCs w:val="18"/>
-        </w:rPr>
-        <w:t xml:space="preserve"> P</w:t>
-      </w:r>
-      <w:r>
-        <w:rPr>
-          <w:sz w:val="18"/>
-          <w:szCs w:val="18"/>
-        </w:rPr>
-        <w:t>ROPAGATION</w:t>
-      </w:r>
-      <w:r>
-        <w:rPr>
-          <w:sz w:val="18"/>
-          <w:szCs w:val="18"/>
-        </w:rPr>
-        <w:t xml:space="preserve"> A</w:t>
-      </w:r>
-      <w:r>
-        <w:rPr>
-          <w:sz w:val="18"/>
-          <w:szCs w:val="18"/>
-        </w:rPr>
-        <w:t>LGORITHM</w:t>
-      </w:r>
-    </w:p>
-    <w:p>
-      <w:pPr>
-        <w:spacing w:after="0"/>
-        <w:rPr>
-          <w:sz w:val="18"/>
-          <w:szCs w:val="18"/>
-        </w:rPr>
-      </w:pPr>
-    </w:p>
-    <w:p>
-      <w:pPr>
-        <w:spacing w:after="0"/>
-        <w:rPr>
-          <w:sz w:val="18"/>
-          <w:szCs w:val="18"/>
-        </w:rPr>
-      </w:pPr>
-      <w:r>
-        <w:rPr>
-          <w:sz w:val="18"/>
-          <w:szCs w:val="18"/>
-        </w:rPr>
-        <w:t>N</w:t>
-      </w:r>
-      <w:r>
-        <w:rPr>
-          <w:sz w:val="18"/>
-          <w:szCs w:val="18"/>
-        </w:rPr>
-        <w:t>ETWORK DIFFUSION:</w:t>
-      </w:r>
-      <w:r>
-        <w:rPr>
-          <w:sz w:val="18"/>
-          <w:szCs w:val="18"/>
-        </w:rPr>
-        <w:t xml:space="preserve"> E</w:t>
-      </w:r>
-      <w:r>
-        <w:rPr>
-          <w:sz w:val="18"/>
-          <w:szCs w:val="18"/>
-        </w:rPr>
-        <w:t>PIDEMIC SPREADING</w:t>
-      </w:r>
-    </w:p>
-    <w:p>
-      <w:pPr>
-        <w:spacing w:after="0"/>
-        <w:rPr>
-          <w:sz w:val="18"/>
-          <w:szCs w:val="18"/>
-        </w:rPr>
-      </w:pPr>
-      <w:r>
-        <w:rPr>
-          <w:sz w:val="18"/>
-          <w:szCs w:val="18"/>
-        </w:rPr>
-        <w:t xml:space="preserve">SIS </w:t>
-      </w:r>
-      <w:r>
-        <w:rPr>
-          <w:sz w:val="18"/>
-          <w:szCs w:val="18"/>
-        </w:rPr>
-        <w:t>EPIDEMIC MODEL</w:t>
-      </w:r>
-    </w:p>
-    <w:p>
-      <w:pPr>
-        <w:spacing w:after="0"/>
-        <w:rPr>
-          <w:sz w:val="18"/>
-          <w:szCs w:val="18"/>
-        </w:rPr>
-      </w:pPr>
-      <w:r>
-        <w:rPr>
-          <w:sz w:val="18"/>
-          <w:szCs w:val="18"/>
-        </w:rPr>
-        <w:t>SIR EPIDEMIC MODEL</w:t>
-      </w:r>
-      <w:r>
-        <w:rPr>
-          <w:sz w:val="18"/>
-          <w:szCs w:val="18"/>
-        </w:rPr>
-        <w:t xml:space="preserve"> </w:t>
-      </w:r>
-    </w:p>
-    <w:p>
-      <w:pPr>
-        <w:spacing w:after="0"/>
-        <w:rPr>
-          <w:sz w:val="18"/>
-          <w:szCs w:val="18"/>
-        </w:rPr>
-      </w:pPr>
-      <w:r>
-        <w:rPr>
-          <w:sz w:val="18"/>
-          <w:szCs w:val="18"/>
-        </w:rPr>
-        <w:t>SIRS EPIDEMIC MODEL</w:t>
-      </w:r>
-      <w:r>
-        <w:rPr>
-          <w:sz w:val="18"/>
-          <w:szCs w:val="18"/>
-        </w:rPr>
-        <w:t xml:space="preserve"> </w:t>
-      </w:r>
-    </w:p>
-    <w:p>
-      <w:pPr>
-        <w:spacing w:after="0"/>
-        <w:rPr>
-          <w:sz w:val="18"/>
-          <w:szCs w:val="18"/>
-        </w:rPr>
-      </w:pPr>
-      <w:r>
-        <w:rPr>
-          <w:sz w:val="18"/>
-          <w:szCs w:val="18"/>
-        </w:rPr>
-        <w:t>SIRS EPIDEMIC MODEL</w:t>
-      </w:r>
-      <w:r>
-        <w:rPr>
-          <w:sz w:val="18"/>
-          <w:szCs w:val="18"/>
-        </w:rPr>
-        <w:t xml:space="preserve"> </w:t>
-      </w:r>
-      <w:r>
-        <w:rPr>
-          <w:sz w:val="18"/>
-          <w:szCs w:val="18"/>
-        </w:rPr>
-        <w:t>+ S</w:t>
-      </w:r>
-      <w:r>
-        <w:rPr>
-          <w:sz w:val="18"/>
-          <w:szCs w:val="18"/>
-        </w:rPr>
-        <w:t>MALL WORLD</w:t>
-      </w:r>
-    </w:p>
-    <w:p>
-      <w:pPr>
-        <w:spacing w:after="0"/>
-        <w:rPr>
-          <w:sz w:val="18"/>
-          <w:szCs w:val="18"/>
-        </w:rPr>
-      </w:pPr>
-    </w:p>
-    <w:p>
-      <w:pPr>
-        <w:spacing w:after="0"/>
-        <w:rPr>
-          <w:sz w:val="18"/>
-          <w:szCs w:val="18"/>
-        </w:rPr>
-      </w:pPr>
-      <w:r>
-        <w:rPr>
-          <w:sz w:val="18"/>
-          <w:szCs w:val="18"/>
-        </w:rPr>
-        <w:t>D</w:t>
-      </w:r>
-      <w:r>
-        <w:rPr>
-          <w:sz w:val="18"/>
-          <w:szCs w:val="18"/>
-        </w:rPr>
-        <w:t>YNAMICS</w:t>
-      </w:r>
-      <w:r>
-        <w:rPr>
-          <w:sz w:val="18"/>
-          <w:szCs w:val="18"/>
-        </w:rPr>
-        <w:t>: S</w:t>
-      </w:r>
-      <w:r>
-        <w:rPr>
-          <w:sz w:val="18"/>
-          <w:szCs w:val="18"/>
-        </w:rPr>
-        <w:t>OCIAL CONTAGION</w:t>
+        <w:t>OVERLAPPING COMMUNITIES</w:t>
+      </w:r>
+    </w:p>
+    <w:p>
+      <w:pPr>
+        <w:spacing w:after="0"/>
+        <w:rPr>
+          <w:sz w:val="18"/>
+          <w:szCs w:val="18"/>
+        </w:rPr>
+      </w:pPr>
+      <w:r>
+        <w:rPr>
+          <w:sz w:val="18"/>
+          <w:szCs w:val="18"/>
+        </w:rPr>
+        <w:t>SPEAKER-LISTENER LABEL PROPAGATION ALGORITHM</w:t>
+      </w:r>
+    </w:p>
+    <w:p>
+      <w:pPr>
+        <w:spacing w:after="0"/>
+        <w:rPr>
+          <w:sz w:val="18"/>
+          <w:szCs w:val="18"/>
+        </w:rPr>
+      </w:pPr>
+    </w:p>
+    <w:p>
+      <w:pPr>
+        <w:spacing w:after="0"/>
+        <w:rPr>
+          <w:sz w:val="18"/>
+          <w:szCs w:val="18"/>
+        </w:rPr>
+      </w:pPr>
+      <w:r>
+        <w:rPr>
+          <w:sz w:val="18"/>
+          <w:szCs w:val="18"/>
+        </w:rPr>
+        <w:t>NETWORK DIFFUSION: EPIDEMIC SPREADING</w:t>
+      </w:r>
+    </w:p>
+    <w:p>
+      <w:pPr>
+        <w:spacing w:after="0"/>
+        <w:rPr>
+          <w:sz w:val="18"/>
+          <w:szCs w:val="18"/>
+        </w:rPr>
+      </w:pPr>
+      <w:r>
+        <w:rPr>
+          <w:sz w:val="18"/>
+          <w:szCs w:val="18"/>
+        </w:rPr>
+        <w:t>SIS EPIDEMIC MODEL</w:t>
+      </w:r>
+    </w:p>
+    <w:p>
+      <w:pPr>
+        <w:spacing w:after="0"/>
+        <w:rPr>
+          <w:sz w:val="18"/>
+          <w:szCs w:val="18"/>
+        </w:rPr>
+      </w:pPr>
+      <w:r>
+        <w:rPr>
+          <w:sz w:val="18"/>
+          <w:szCs w:val="18"/>
+        </w:rPr>
+        <w:t xml:space="preserve">SIR EPIDEMIC MODEL </w:t>
+      </w:r>
+    </w:p>
+    <w:p>
+      <w:pPr>
+        <w:spacing w:after="0"/>
+        <w:rPr>
+          <w:sz w:val="18"/>
+          <w:szCs w:val="18"/>
+        </w:rPr>
+      </w:pPr>
+      <w:r>
+        <w:rPr>
+          <w:sz w:val="18"/>
+          <w:szCs w:val="18"/>
+        </w:rPr>
+        <w:t xml:space="preserve">SIRS EPIDEMIC MODEL </w:t>
+      </w:r>
+    </w:p>
+    <w:p>
+      <w:pPr>
+        <w:spacing w:after="0"/>
+        <w:rPr>
+          <w:sz w:val="18"/>
+          <w:szCs w:val="18"/>
+        </w:rPr>
+      </w:pPr>
+      <w:r>
+        <w:rPr>
+          <w:sz w:val="18"/>
+          <w:szCs w:val="18"/>
+        </w:rPr>
+        <w:t>SIRS EPIDEMIC MODEL + SMALL WORLD</w:t>
+      </w:r>
+    </w:p>
+    <w:p>
+      <w:pPr>
+        <w:spacing w:after="0"/>
+        <w:rPr>
+          <w:sz w:val="18"/>
+          <w:szCs w:val="18"/>
+        </w:rPr>
+      </w:pPr>
+    </w:p>
+    <w:p>
+      <w:pPr>
+        <w:spacing w:after="0"/>
+        <w:rPr>
+          <w:sz w:val="18"/>
+          <w:szCs w:val="18"/>
+        </w:rPr>
+      </w:pPr>
+      <w:r>
+        <w:rPr>
+          <w:sz w:val="18"/>
+          <w:szCs w:val="18"/>
+        </w:rPr>
+        <w:t>DYNAMICS: SOCIAL CONTAGION</w:t>
       </w:r>
     </w:p>
     <w:p>
@@ -2134,27 +1558,7 @@
           <w:szCs w:val="18"/>
         </w:rPr>
         <w:tab/>
-      </w:r>
-      <w:r>
-        <w:rPr>
-          <w:sz w:val="18"/>
-          <w:szCs w:val="18"/>
-        </w:rPr>
-        <w:t>S</w:t>
-      </w:r>
-      <w:r>
-        <w:rPr>
-          <w:sz w:val="18"/>
-          <w:szCs w:val="18"/>
-        </w:rPr>
-        <w:t xml:space="preserve">IMPLE </w:t>
-      </w:r>
-      <w:r>
-        <w:rPr>
-          <w:sz w:val="18"/>
-          <w:szCs w:val="18"/>
-        </w:rPr>
-        <w:t>CONTAGION</w:t>
+        <w:t>SIMPLE CONTAGION</w:t>
       </w:r>
     </w:p>
     <w:p>
@@ -2171,14 +1575,7 @@
           <w:szCs w:val="18"/>
         </w:rPr>
         <w:tab/>
-        <w:t xml:space="preserve">COMPLEX </w:t>
-      </w:r>
-      <w:r>
-        <w:rPr>
-          <w:sz w:val="18"/>
-          <w:szCs w:val="18"/>
-        </w:rPr>
-        <w:t>CONTAGION</w:t>
+        <w:t>COMPLEX CONTAGION</w:t>
       </w:r>
     </w:p>
     <w:p>
@@ -2195,52 +1592,32 @@
           <w:szCs w:val="18"/>
         </w:rPr>
         <w:tab/>
-      </w:r>
-      <w:r>
-        <w:rPr>
-          <w:sz w:val="18"/>
-          <w:szCs w:val="18"/>
-        </w:rPr>
-        <w:t>T</w:t>
-      </w:r>
-      <w:r>
-        <w:rPr>
-          <w:sz w:val="18"/>
-          <w:szCs w:val="18"/>
-        </w:rPr>
-        <w:t>HRESHOLD MODEL</w:t>
-      </w:r>
-    </w:p>
-    <w:p>
-      <w:pPr>
-        <w:spacing w:after="0"/>
-        <w:rPr>
-          <w:sz w:val="18"/>
-          <w:szCs w:val="18"/>
-        </w:rPr>
-      </w:pPr>
-    </w:p>
-    <w:p>
-      <w:pPr>
-        <w:spacing w:after="0"/>
-        <w:rPr>
-          <w:sz w:val="18"/>
-          <w:szCs w:val="18"/>
-        </w:rPr>
-      </w:pPr>
-      <w:r>
-        <w:rPr>
-          <w:sz w:val="18"/>
-          <w:szCs w:val="18"/>
-        </w:rPr>
-        <w:t>N</w:t>
-      </w:r>
-      <w:r>
-        <w:rPr>
-          <w:sz w:val="18"/>
-          <w:szCs w:val="18"/>
-        </w:rPr>
-        <w:t>ETWORK ROBUSTNESS</w:t>
+        <w:t>THRESHOLD MODEL</w:t>
+      </w:r>
+    </w:p>
+    <w:p>
+      <w:pPr>
+        <w:spacing w:after="0"/>
+        <w:rPr>
+          <w:sz w:val="18"/>
+          <w:szCs w:val="18"/>
+        </w:rPr>
+      </w:pPr>
+    </w:p>
+    <w:p>
+      <w:pPr>
+        <w:spacing w:after="0"/>
+        <w:rPr>
+          <w:sz w:val="18"/>
+          <w:szCs w:val="18"/>
+        </w:rPr>
+      </w:pPr>
+      <w:r>
+        <w:rPr>
+          <w:sz w:val="18"/>
+          <w:szCs w:val="18"/>
+        </w:rPr>
+        <w:t>NETWORK ROBUSTNESS</w:t>
       </w:r>
     </w:p>
     <w:p>
@@ -2257,20 +1634,7 @@
           <w:szCs w:val="18"/>
         </w:rPr>
         <w:tab/>
-      </w:r>
-      <w:r>
-        <w:rPr>
-          <w:sz w:val="18"/>
-          <w:szCs w:val="18"/>
-        </w:rPr>
-        <w:t>P</w:t>
-      </w:r>
-      <w:r>
-        <w:rPr>
-          <w:sz w:val="18"/>
-          <w:szCs w:val="18"/>
-        </w:rPr>
-        <w:t>ERCOLATION THEORY</w:t>
+        <w:t>PERCOLATION THEORY</w:t>
       </w:r>
     </w:p>
     <w:p>
@@ -2287,124 +1651,89 @@
           <w:szCs w:val="18"/>
         </w:rPr>
         <w:tab/>
-        <w:t xml:space="preserve">INVERSE </w:t>
-      </w:r>
-      <w:r>
-        <w:rPr>
-          <w:sz w:val="18"/>
-          <w:szCs w:val="18"/>
-        </w:rPr>
-        <w:t>PERCOLATION THEORY</w:t>
-      </w:r>
-    </w:p>
-    <w:p>
-      <w:pPr>
-        <w:spacing w:after="0"/>
-        <w:rPr>
-          <w:sz w:val="18"/>
-          <w:szCs w:val="18"/>
-        </w:rPr>
-      </w:pPr>
-    </w:p>
-    <w:p>
-      <w:pPr>
-        <w:spacing w:after="0"/>
-        <w:rPr>
-          <w:sz w:val="18"/>
-          <w:szCs w:val="18"/>
-        </w:rPr>
-      </w:pPr>
-      <w:r>
-        <w:rPr>
-          <w:sz w:val="18"/>
-          <w:szCs w:val="18"/>
-        </w:rPr>
-        <w:t>R</w:t>
-      </w:r>
-      <w:r>
-        <w:rPr>
-          <w:sz w:val="18"/>
-          <w:szCs w:val="18"/>
-        </w:rPr>
-        <w:t>OBUSTNESS OF SCALE-FREE NETWORKS</w:t>
-      </w:r>
-    </w:p>
-    <w:p>
-      <w:pPr>
-        <w:spacing w:after="0"/>
-        <w:rPr>
-          <w:sz w:val="18"/>
-          <w:szCs w:val="18"/>
-        </w:rPr>
-      </w:pPr>
-      <w:r>
-        <w:rPr>
-          <w:sz w:val="18"/>
-          <w:szCs w:val="18"/>
-        </w:rPr>
-        <w:t>M</w:t>
-      </w:r>
-      <w:r>
-        <w:rPr>
-          <w:sz w:val="18"/>
-          <w:szCs w:val="18"/>
-        </w:rPr>
-        <w:t>OLLOY-REED CRITERION</w:t>
-      </w:r>
-    </w:p>
-    <w:p>
-      <w:pPr>
-        <w:spacing w:after="0"/>
-        <w:rPr>
-          <w:sz w:val="18"/>
-          <w:szCs w:val="18"/>
-        </w:rPr>
-      </w:pPr>
-      <w:r>
-        <w:rPr>
-          <w:sz w:val="18"/>
-          <w:szCs w:val="18"/>
-        </w:rPr>
-        <w:t>B</w:t>
-      </w:r>
-      <w:r>
-        <w:rPr>
-          <w:sz w:val="18"/>
-          <w:szCs w:val="18"/>
-        </w:rPr>
-        <w:t>ARABASI ET AL. EXPERIMENT</w:t>
-      </w:r>
-    </w:p>
-    <w:p>
-      <w:pPr>
-        <w:spacing w:after="0"/>
-        <w:rPr>
-          <w:sz w:val="18"/>
-          <w:szCs w:val="18"/>
-        </w:rPr>
-      </w:pPr>
-    </w:p>
-    <w:p>
-      <w:pPr>
-        <w:spacing w:after="0"/>
-        <w:rPr>
-          <w:sz w:val="18"/>
-          <w:szCs w:val="18"/>
-        </w:rPr>
-      </w:pPr>
-      <w:r>
-        <w:rPr>
-          <w:sz w:val="18"/>
-          <w:szCs w:val="18"/>
-        </w:rPr>
-        <w:t>C</w:t>
-      </w:r>
-      <w:r>
-        <w:rPr>
-          <w:sz w:val="18"/>
-          <w:szCs w:val="18"/>
-        </w:rPr>
-        <w:t>ASCADING FAILURES</w:t>
+        <w:t>INVERSE PERCOLATION THEORY</w:t>
+      </w:r>
+    </w:p>
+    <w:p>
+      <w:pPr>
+        <w:spacing w:after="0"/>
+        <w:rPr>
+          <w:sz w:val="18"/>
+          <w:szCs w:val="18"/>
+        </w:rPr>
+      </w:pPr>
+    </w:p>
+    <w:p>
+      <w:pPr>
+        <w:spacing w:after="0"/>
+        <w:rPr>
+          <w:sz w:val="18"/>
+          <w:szCs w:val="18"/>
+        </w:rPr>
+      </w:pPr>
+      <w:r>
+        <w:rPr>
+          <w:sz w:val="18"/>
+          <w:szCs w:val="18"/>
+        </w:rPr>
+        <w:t>ROBUSTNESS OF SCALE-FREE NETWORKS</w:t>
+      </w:r>
+    </w:p>
+    <w:p>
+      <w:pPr>
+        <w:spacing w:after="0"/>
+        <w:rPr>
+          <w:sz w:val="18"/>
+          <w:szCs w:val="18"/>
+        </w:rPr>
+      </w:pPr>
+      <w:r>
+        <w:rPr>
+          <w:sz w:val="18"/>
+          <w:szCs w:val="18"/>
+        </w:rPr>
+        <w:t>MOLLOY-REED CRITERION</w:t>
+      </w:r>
+    </w:p>
+    <w:p>
+      <w:pPr>
+        <w:spacing w:after="0"/>
+        <w:rPr>
+          <w:sz w:val="18"/>
+          <w:szCs w:val="18"/>
+        </w:rPr>
+      </w:pPr>
+      <w:r>
+        <w:rPr>
+          <w:sz w:val="18"/>
+          <w:szCs w:val="18"/>
+        </w:rPr>
+        <w:t>BARABASI ET AL. EXPERIMENT</w:t>
+      </w:r>
+    </w:p>
+    <w:p>
+      <w:pPr>
+        <w:spacing w:after="0"/>
+        <w:rPr>
+          <w:sz w:val="18"/>
+          <w:szCs w:val="18"/>
+        </w:rPr>
+      </w:pPr>
+    </w:p>
+    <w:p>
+      <w:pPr>
+        <w:spacing w:after="0"/>
+        <w:rPr>
+          <w:sz w:val="18"/>
+          <w:szCs w:val="18"/>
+        </w:rPr>
+      </w:pPr>
+      <w:r>
+        <w:rPr>
+          <w:sz w:val="18"/>
+          <w:szCs w:val="18"/>
+        </w:rPr>
+        <w:t>CASCADING FAILURES</w:t>
       </w:r>
     </w:p>
     <w:p>
@@ -2421,27 +1750,7 @@
           <w:szCs w:val="18"/>
         </w:rPr>
         <w:tab/>
-      </w:r>
-      <w:r>
-        <w:rPr>
-          <w:sz w:val="18"/>
-          <w:szCs w:val="18"/>
-        </w:rPr>
-        <w:t>F</w:t>
-      </w:r>
-      <w:r>
-        <w:rPr>
-          <w:sz w:val="18"/>
-          <w:szCs w:val="18"/>
-        </w:rPr>
-        <w:t xml:space="preserve">AILURE PROPAGATION </w:t>
-      </w:r>
-      <w:r>
-        <w:rPr>
-          <w:sz w:val="18"/>
-          <w:szCs w:val="18"/>
-        </w:rPr>
-        <w:t>MODEL</w:t>
+        <w:t>FAILURE PROPAGATION MODEL</w:t>
       </w:r>
     </w:p>
     <w:p>
@@ -2458,34 +1767,7 @@
           <w:szCs w:val="18"/>
         </w:rPr>
         <w:tab/>
-      </w:r>
-      <w:r>
-        <w:rPr>
-          <w:sz w:val="18"/>
-          <w:szCs w:val="18"/>
-        </w:rPr>
-        <w:t>B</w:t>
-      </w:r>
-      <w:r>
-        <w:rPr>
-          <w:sz w:val="18"/>
-          <w:szCs w:val="18"/>
-        </w:rPr>
-        <w:t>RANCHING</w:t>
-      </w:r>
-      <w:r>
-        <w:rPr>
-          <w:sz w:val="18"/>
-          <w:szCs w:val="18"/>
-        </w:rPr>
-        <w:t xml:space="preserve"> </w:t>
-      </w:r>
-      <w:r>
-        <w:rPr>
-          <w:sz w:val="18"/>
-          <w:szCs w:val="18"/>
-        </w:rPr>
-        <w:t>MODEL</w:t>
+        <w:t>BRANCHING MODEL</w:t>
       </w:r>
     </w:p>
     <w:p>
@@ -6408,6 +5690,7 @@
   <w:style w:type="character" w:default="1" w:styleId="Carpredefinitoparagrafo">
     <w:name w:val="Default Paragraph Font"/>
     <w:uiPriority w:val="1"/>
+    <w:semiHidden/>
     <w:unhideWhenUsed/>
   </w:style>
   <w:style w:type="table" w:default="1" w:styleId="Tabellanormale">

</xml_diff>